<commit_message>
Report started, will ask about correct of diagrams
</commit_message>
<xml_diff>
--- a/tp/lab-2/ПРИ123-ТП-#02-Нямаа.docx
+++ b/tp/lab-2/ПРИ123-ТП-#02-Нямаа.docx
@@ -564,6 +564,16 @@
     </w:p>
     <w:p>
       <w:pPr>
+        <w:pStyle w:val="a4"/>
+        <w:rPr>
+          <w:rFonts w:ascii="Times New Roman" w:hAnsi="Times New Roman"/>
+          <w:sz w:val="28"/>
+          <w:szCs w:val="28"/>
+        </w:rPr>
+      </w:pPr>
+    </w:p>
+    <w:p>
+      <w:pPr>
         <w:jc w:val="center"/>
         <w:rPr>
           <w:sz w:val="44"/>
@@ -575,68 +585,75 @@
           <w:sz w:val="44"/>
           <w:szCs w:val="44"/>
         </w:rPr>
-        <w:t>Лабораторная работа №1</w:t>
-      </w:r>
-    </w:p>
-    <w:p>
-      <w:pPr>
-        <w:jc w:val="center"/>
+        <w:t>Лабораторная работа №</w:t>
+      </w:r>
+      <w:r>
         <w:rPr>
           <w:sz w:val="44"/>
           <w:szCs w:val="44"/>
         </w:rPr>
-      </w:pPr>
-      <w:r>
+        <w:t>2</w:t>
+      </w:r>
+    </w:p>
+    <w:p>
+      <w:pPr>
+        <w:jc w:val="center"/>
         <w:rPr>
           <w:sz w:val="44"/>
           <w:szCs w:val="44"/>
         </w:rPr>
-        <w:t>по дисциплине «Технологии программирования»</w:t>
-      </w:r>
-    </w:p>
-    <w:p>
-      <w:pPr>
-        <w:rPr>
-          <w:sz w:val="44"/>
-          <w:szCs w:val="28"/>
-        </w:rPr>
-      </w:pPr>
-    </w:p>
-    <w:p>
-      <w:pPr>
-        <w:rPr>
-          <w:sz w:val="28"/>
-          <w:szCs w:val="28"/>
-        </w:rPr>
-      </w:pPr>
-    </w:p>
-    <w:p>
-      <w:pPr>
-        <w:jc w:val="center"/>
-        <w:rPr>
-          <w:sz w:val="36"/>
-          <w:szCs w:val="28"/>
-        </w:rPr>
-      </w:pPr>
-      <w:r>
-        <w:rPr>
-          <w:sz w:val="44"/>
-          <w:szCs w:val="28"/>
-        </w:rPr>
-        <w:t>Тема: «</w:t>
-      </w:r>
+      </w:pPr>
       <w:r>
         <w:rPr>
           <w:sz w:val="44"/>
           <w:szCs w:val="44"/>
         </w:rPr>
-        <w:t>Анализ прецедентов работы с программной системой. Моделирование взаимоотношений ИС и элементов внешней среды. Разработка диаграмм прецедентов</w:t>
-      </w:r>
-      <w:r>
+        <w:t>по дисциплине «Технологии программирования»</w:t>
+      </w:r>
+    </w:p>
+    <w:p>
+      <w:pPr>
         <w:rPr>
           <w:sz w:val="44"/>
           <w:szCs w:val="28"/>
         </w:rPr>
+      </w:pPr>
+    </w:p>
+    <w:p>
+      <w:pPr>
+        <w:rPr>
+          <w:sz w:val="28"/>
+          <w:szCs w:val="28"/>
+        </w:rPr>
+      </w:pPr>
+    </w:p>
+    <w:p>
+      <w:pPr>
+        <w:jc w:val="center"/>
+        <w:rPr>
+          <w:sz w:val="36"/>
+          <w:szCs w:val="28"/>
+        </w:rPr>
+      </w:pPr>
+      <w:r>
+        <w:rPr>
+          <w:sz w:val="44"/>
+          <w:szCs w:val="28"/>
+        </w:rPr>
+        <w:t>Тема: «</w:t>
+      </w:r>
+      <w:r>
+        <w:rPr>
+          <w:sz w:val="44"/>
+          <w:szCs w:val="44"/>
+        </w:rPr>
+        <w:t>Динамическое моделирование работы системы.</w:t>
+      </w:r>
+      <w:r>
+        <w:rPr>
+          <w:sz w:val="44"/>
+          <w:szCs w:val="28"/>
+        </w:rPr>
         <w:t>»</w:t>
       </w:r>
     </w:p>
@@ -684,6 +701,14 @@
     </w:p>
     <w:p>
       <w:pPr>
+        <w:rPr>
+          <w:sz w:val="28"/>
+          <w:szCs w:val="28"/>
+        </w:rPr>
+      </w:pPr>
+    </w:p>
+    <w:p>
+      <w:pPr>
         <w:ind w:left="6663" w:hanging="284"/>
         <w:rPr>
           <w:sz w:val="28"/>
@@ -800,6 +825,16 @@
         </w:rPr>
         <w:t>В.В. Данилов</w:t>
       </w:r>
+    </w:p>
+    <w:p>
+      <w:pPr>
+        <w:pStyle w:val="a4"/>
+        <w:rPr>
+          <w:rFonts w:ascii="Times New Roman" w:hAnsi="Times New Roman"/>
+          <w:sz w:val="28"/>
+          <w:szCs w:val="28"/>
+        </w:rPr>
+      </w:pPr>
     </w:p>
     <w:p>
       <w:pPr>
@@ -915,45 +950,55 @@
         <w:rPr>
           <w:sz w:val="28"/>
         </w:rPr>
-        <w:t xml:space="preserve">Научиться моделировать взаимоотношения элементов внешней среды с элементами </w:t>
-      </w:r>
-      <w:r>
-        <w:rPr>
-          <w:sz w:val="28"/>
-        </w:rPr>
-        <w:t>проектируемой</w:t>
-      </w:r>
-      <w:r>
-        <w:rPr>
-          <w:sz w:val="28"/>
-        </w:rPr>
-        <w:t xml:space="preserve"> программной </w:t>
-      </w:r>
-      <w:r>
-        <w:rPr>
-          <w:sz w:val="28"/>
-        </w:rPr>
-        <w:t>системы</w:t>
-      </w:r>
-      <w:r>
-        <w:rPr>
-          <w:sz w:val="28"/>
-        </w:rPr>
-        <w:t xml:space="preserve"> через синтез прецедентов, их расширенное описание и включение диаграмму </w:t>
+        <w:t xml:space="preserve">Изучить методы анализа поведения компонентов программной системы путем синтеза диаграмм, описывающих поведение моделируемой ИС с использованием нотации </w:t>
       </w:r>
       <w:proofErr w:type="spellStart"/>
       <w:r>
         <w:rPr>
           <w:sz w:val="28"/>
-        </w:rPr>
-        <w:t>UseCase</w:t>
+          <w:lang w:val="en-US"/>
+        </w:rPr>
+        <w:t>Uml</w:t>
       </w:r>
       <w:proofErr w:type="spellEnd"/>
       <w:r>
         <w:rPr>
           <w:sz w:val="28"/>
         </w:rPr>
-        <w:t xml:space="preserve">. </w:t>
+        <w:t>.</w:t>
+      </w:r>
+    </w:p>
+    <w:p>
+      <w:pPr>
+        <w:spacing w:line="360" w:lineRule="auto"/>
+        <w:jc w:val="center"/>
+        <w:rPr>
+          <w:sz w:val="28"/>
+        </w:rPr>
+      </w:pPr>
+      <w:r>
+        <w:rPr>
+          <w:sz w:val="28"/>
+        </w:rPr>
+        <w:t>ЗАДАНИЕ</w:t>
+      </w:r>
+      <w:r>
+        <w:rPr>
+          <w:sz w:val="28"/>
+        </w:rPr>
+        <w:t xml:space="preserve"> (</w:t>
+      </w:r>
+      <w:r>
+        <w:rPr>
+          <w:sz w:val="28"/>
+        </w:rPr>
+        <w:t>вариант</w:t>
+      </w:r>
+      <w:r>
+        <w:rPr>
+          <w:sz w:val="28"/>
+        </w:rPr>
+        <w:t xml:space="preserve"> 14).</w:t>
       </w:r>
     </w:p>
     <w:p>
@@ -969,66 +1014,7 @@
         <w:rPr>
           <w:sz w:val="28"/>
         </w:rPr>
-        <w:t>Выполнить анализ объекта информатизации и смоделировать структуры будущей программной системы на верхнем уровне в виде конечных диаграмм классов.</w:t>
-      </w:r>
-    </w:p>
-    <w:p>
-      <w:pPr>
-        <w:spacing w:line="360" w:lineRule="auto"/>
-        <w:jc w:val="center"/>
-        <w:rPr>
-          <w:sz w:val="28"/>
-        </w:rPr>
-      </w:pPr>
-      <w:r>
-        <w:rPr>
-          <w:sz w:val="28"/>
-        </w:rPr>
-        <w:t>ЗАДАНИЕ (вариант 14).</w:t>
-      </w:r>
-    </w:p>
-    <w:p>
-      <w:pPr>
-        <w:spacing w:line="360" w:lineRule="auto"/>
-        <w:ind w:firstLine="708"/>
-        <w:jc w:val="both"/>
-        <w:rPr>
-          <w:sz w:val="28"/>
-        </w:rPr>
-      </w:pPr>
-      <w:r>
-        <w:rPr>
-          <w:sz w:val="28"/>
-        </w:rPr>
-        <w:t>Построить диаграмму прецедентов (</w:t>
-      </w:r>
-      <w:proofErr w:type="spellStart"/>
-      <w:r>
-        <w:rPr>
-          <w:sz w:val="28"/>
-        </w:rPr>
-        <w:t>use</w:t>
-      </w:r>
-      <w:proofErr w:type="spellEnd"/>
-      <w:r>
-        <w:rPr>
-          <w:sz w:val="28"/>
-        </w:rPr>
-        <w:t xml:space="preserve"> </w:t>
-      </w:r>
-      <w:proofErr w:type="spellStart"/>
-      <w:r>
-        <w:rPr>
-          <w:sz w:val="28"/>
-        </w:rPr>
-        <w:t>case</w:t>
-      </w:r>
-      <w:proofErr w:type="spellEnd"/>
-      <w:r>
-        <w:rPr>
-          <w:sz w:val="28"/>
-        </w:rPr>
-        <w:t>) и диаграмму классов, подробно описать 3-4 прецедента.</w:t>
+        <w:t>Произвести анализ предметной области. Выделить сущности предметной области, определить их взаимосвязи, атрибуты и поведение.</w:t>
       </w:r>
     </w:p>
     <w:p>
@@ -1084,17 +1070,18 @@
         <w:rPr>
           <w:sz w:val="28"/>
           <w:szCs w:val="28"/>
-        </w:rPr>
-      </w:pPr>
-      <w:r>
-        <w:rPr>
-          <w:noProof/>
-          <w:sz w:val="28"/>
-          <w:szCs w:val="28"/>
+          <w:lang w:val="ru-RU"/>
+        </w:rPr>
+      </w:pPr>
+      <w:r>
+        <w:rPr>
+          <w:sz w:val="28"/>
+          <w:szCs w:val="28"/>
+          <w:lang w:val="ru-RU"/>
         </w:rPr>
         <w:drawing>
-          <wp:inline distT="0" distB="0" distL="0" distR="0" wp14:anchorId="788C8C71" wp14:editId="64F58460">
-            <wp:extent cx="5489143" cy="4578350"/>
+          <wp:inline distT="0" distB="0" distL="0" distR="0" wp14:anchorId="5D0983B1" wp14:editId="76C55586">
+            <wp:extent cx="5786120" cy="5471919"/>
             <wp:effectExtent l="0" t="0" r="0" b="0"/>
             <wp:docPr id="1" name="Рисунок 1"/>
             <wp:cNvGraphicFramePr>
@@ -1107,27 +1094,20 @@
                     <pic:cNvPr id="1" name=""/>
                     <pic:cNvPicPr/>
                   </pic:nvPicPr>
-                  <pic:blipFill rotWithShape="1">
+                  <pic:blipFill>
                     <a:blip r:embed="rId7"/>
-                    <a:srcRect l="4978" t="2775"/>
-                    <a:stretch/>
+                    <a:stretch>
+                      <a:fillRect/>
+                    </a:stretch>
                   </pic:blipFill>
-                  <pic:spPr bwMode="auto">
+                  <pic:spPr>
                     <a:xfrm>
                       <a:off x="0" y="0"/>
-                      <a:ext cx="5501773" cy="4588885"/>
+                      <a:ext cx="5788218" cy="5473903"/>
                     </a:xfrm>
                     <a:prstGeom prst="rect">
                       <a:avLst/>
                     </a:prstGeom>
-                    <a:ln>
-                      <a:noFill/>
-                    </a:ln>
-                    <a:extLst>
-                      <a:ext uri="{53640926-AAD7-44D8-BBD7-CCE9431645EC}">
-                        <a14:shadowObscured xmlns:a14="http://schemas.microsoft.com/office/drawing/2010/main"/>
-                      </a:ext>
-                    </a:extLst>
                   </pic:spPr>
                 </pic:pic>
               </a:graphicData>
@@ -1159,1060 +1139,23 @@
     <w:p>
       <w:pPr>
         <w:spacing w:line="360" w:lineRule="auto"/>
-        <w:ind w:firstLine="709"/>
-        <w:jc w:val="both"/>
-        <w:rPr>
-          <w:sz w:val="28"/>
-          <w:szCs w:val="28"/>
-        </w:rPr>
-      </w:pPr>
-      <w:r>
-        <w:rPr>
-          <w:sz w:val="28"/>
-          <w:szCs w:val="28"/>
-        </w:rPr>
-        <w:lastRenderedPageBreak/>
-        <w:t>Также были подробно описаны 3 прецедента:</w:t>
-      </w:r>
-    </w:p>
-    <w:p>
-      <w:pPr>
-        <w:pStyle w:val="a6"/>
-        <w:numPr>
-          <w:ilvl w:val="0"/>
-          <w:numId w:val="2"/>
-        </w:numPr>
-        <w:spacing w:line="360" w:lineRule="auto"/>
-        <w:ind w:left="0" w:firstLine="709"/>
-        <w:jc w:val="both"/>
-        <w:rPr>
-          <w:sz w:val="28"/>
-          <w:szCs w:val="28"/>
-        </w:rPr>
-      </w:pPr>
-      <w:r>
-        <w:rPr>
-          <w:sz w:val="28"/>
-          <w:szCs w:val="28"/>
-        </w:rPr>
-        <w:t xml:space="preserve">Прецедент «Аренда </w:t>
-      </w:r>
-      <w:r>
-        <w:rPr>
-          <w:sz w:val="28"/>
-          <w:szCs w:val="28"/>
-          <w:lang w:val="en-US"/>
-        </w:rPr>
-        <w:t>VPS</w:t>
-      </w:r>
-      <w:r>
-        <w:rPr>
-          <w:sz w:val="28"/>
-          <w:szCs w:val="28"/>
-        </w:rPr>
-        <w:t>».</w:t>
-      </w:r>
-    </w:p>
-    <w:p>
-      <w:pPr>
-        <w:spacing w:line="360" w:lineRule="auto"/>
-        <w:ind w:firstLine="709"/>
-        <w:jc w:val="both"/>
-        <w:rPr>
-          <w:sz w:val="28"/>
-          <w:szCs w:val="28"/>
-        </w:rPr>
-      </w:pPr>
-      <w:r>
-        <w:rPr>
-          <w:sz w:val="28"/>
-          <w:szCs w:val="28"/>
-        </w:rPr>
-        <w:t xml:space="preserve">Название: «Аренда </w:t>
-      </w:r>
-      <w:r>
-        <w:rPr>
-          <w:sz w:val="28"/>
-          <w:szCs w:val="28"/>
-          <w:lang w:val="en-US"/>
-        </w:rPr>
-        <w:t>VPS</w:t>
-      </w:r>
-      <w:r>
-        <w:rPr>
-          <w:sz w:val="28"/>
-          <w:szCs w:val="28"/>
-        </w:rPr>
-        <w:t>» (</w:t>
-      </w:r>
-      <w:r>
-        <w:rPr>
-          <w:sz w:val="28"/>
-          <w:szCs w:val="28"/>
-          <w:lang w:val="en-US"/>
-        </w:rPr>
-        <w:t>Rent</w:t>
-      </w:r>
-      <w:r>
-        <w:rPr>
-          <w:sz w:val="28"/>
-          <w:szCs w:val="28"/>
-        </w:rPr>
-        <w:t xml:space="preserve"> </w:t>
-      </w:r>
-      <w:r>
-        <w:rPr>
-          <w:sz w:val="28"/>
-          <w:szCs w:val="28"/>
-          <w:lang w:val="en-US"/>
-        </w:rPr>
-        <w:t>VPS</w:t>
-      </w:r>
-      <w:r>
-        <w:rPr>
-          <w:sz w:val="28"/>
-          <w:szCs w:val="28"/>
-        </w:rPr>
-        <w:t>)</w:t>
-      </w:r>
-      <w:r>
-        <w:rPr>
-          <w:sz w:val="28"/>
-          <w:szCs w:val="28"/>
-        </w:rPr>
-        <w:t>.</w:t>
-      </w:r>
-    </w:p>
-    <w:p>
-      <w:pPr>
-        <w:spacing w:line="360" w:lineRule="auto"/>
-        <w:ind w:firstLine="709"/>
-        <w:jc w:val="both"/>
-        <w:rPr>
-          <w:sz w:val="28"/>
-          <w:szCs w:val="28"/>
-        </w:rPr>
-      </w:pPr>
-      <w:r>
-        <w:rPr>
-          <w:sz w:val="28"/>
-          <w:szCs w:val="28"/>
-        </w:rPr>
-        <w:t>Предусловие:</w:t>
-      </w:r>
-      <w:r>
-        <w:rPr>
-          <w:sz w:val="28"/>
-          <w:szCs w:val="28"/>
-        </w:rPr>
-        <w:t xml:space="preserve"> пользователь, желающий арендовать </w:t>
-      </w:r>
-      <w:r>
-        <w:rPr>
-          <w:sz w:val="28"/>
-          <w:szCs w:val="28"/>
-          <w:lang w:val="en-US"/>
-        </w:rPr>
-        <w:t>VPS</w:t>
-      </w:r>
-      <w:r>
-        <w:rPr>
-          <w:sz w:val="28"/>
-          <w:szCs w:val="28"/>
-        </w:rPr>
-        <w:t xml:space="preserve">, </w:t>
-      </w:r>
-      <w:r>
-        <w:rPr>
-          <w:sz w:val="28"/>
-          <w:szCs w:val="28"/>
-        </w:rPr>
-        <w:t>зарегистрирован и авторизован в веб-приложении.</w:t>
-      </w:r>
-    </w:p>
-    <w:p>
-      <w:pPr>
-        <w:spacing w:line="360" w:lineRule="auto"/>
-        <w:ind w:firstLine="709"/>
-        <w:jc w:val="both"/>
-        <w:rPr>
-          <w:sz w:val="28"/>
-          <w:szCs w:val="28"/>
-        </w:rPr>
-      </w:pPr>
-      <w:r>
-        <w:rPr>
-          <w:sz w:val="28"/>
-          <w:szCs w:val="28"/>
-        </w:rPr>
-        <w:t>Действующее лицо: клиент веб-приложения.</w:t>
-      </w:r>
-    </w:p>
-    <w:p>
-      <w:pPr>
-        <w:spacing w:line="360" w:lineRule="auto"/>
-        <w:ind w:firstLine="709"/>
-        <w:jc w:val="both"/>
-        <w:rPr>
-          <w:sz w:val="28"/>
-          <w:szCs w:val="28"/>
-        </w:rPr>
-      </w:pPr>
-      <w:r>
-        <w:rPr>
-          <w:sz w:val="28"/>
-          <w:szCs w:val="28"/>
-        </w:rPr>
-        <w:t>Основной поток:</w:t>
-      </w:r>
-      <w:r>
-        <w:rPr>
-          <w:sz w:val="28"/>
-          <w:szCs w:val="28"/>
-        </w:rPr>
-        <w:t xml:space="preserve"> пользователь нажимает на кнопку «Использовать готовую конфигурацию», что перенаправляет его на страницу с детальным просмотром конфигурации, ценой и условиями использования. </w:t>
-      </w:r>
-    </w:p>
-    <w:p>
-      <w:pPr>
-        <w:spacing w:line="360" w:lineRule="auto"/>
-        <w:ind w:firstLine="709"/>
-        <w:jc w:val="both"/>
-        <w:rPr>
-          <w:sz w:val="28"/>
-          <w:szCs w:val="28"/>
-        </w:rPr>
-      </w:pPr>
-      <w:r>
-        <w:rPr>
-          <w:sz w:val="28"/>
-          <w:szCs w:val="28"/>
-        </w:rPr>
-        <w:t xml:space="preserve">После пользователь нажимает на кнопку «Арендовать», что создает счет на оплату. После оплаты пользователь получает электронный чек и готовый для использования </w:t>
-      </w:r>
-      <w:r>
-        <w:rPr>
-          <w:sz w:val="28"/>
-          <w:szCs w:val="28"/>
-          <w:lang w:val="en-US"/>
-        </w:rPr>
-        <w:t>VPS</w:t>
-      </w:r>
-      <w:r>
-        <w:rPr>
-          <w:sz w:val="28"/>
-          <w:szCs w:val="28"/>
-        </w:rPr>
-        <w:t>.</w:t>
-      </w:r>
-    </w:p>
-    <w:p>
-      <w:pPr>
-        <w:spacing w:line="360" w:lineRule="auto"/>
-        <w:ind w:firstLine="709"/>
-        <w:jc w:val="both"/>
-        <w:rPr>
-          <w:sz w:val="28"/>
-          <w:szCs w:val="28"/>
-        </w:rPr>
-      </w:pPr>
-      <w:r>
-        <w:rPr>
-          <w:sz w:val="28"/>
-          <w:szCs w:val="28"/>
-        </w:rPr>
-        <w:t>Альтернативный поток:</w:t>
-      </w:r>
-      <w:r>
-        <w:rPr>
-          <w:sz w:val="28"/>
-          <w:szCs w:val="28"/>
-        </w:rPr>
-        <w:t xml:space="preserve"> на этапе оплаты виртуальной машины пользователь отменяет операцию, </w:t>
-      </w:r>
-      <w:r>
-        <w:rPr>
-          <w:sz w:val="28"/>
-          <w:szCs w:val="28"/>
-        </w:rPr>
-        <w:t>нажав на кнопку «Отменить». Тогда пользователя перенаправляют на главную страницу, счет на оплату считается невыполненным.</w:t>
-      </w:r>
-    </w:p>
-    <w:p>
-      <w:pPr>
-        <w:spacing w:line="360" w:lineRule="auto"/>
-        <w:ind w:firstLine="709"/>
-        <w:jc w:val="both"/>
-        <w:rPr>
-          <w:sz w:val="28"/>
-          <w:szCs w:val="28"/>
-        </w:rPr>
-      </w:pPr>
-      <w:r>
-        <w:rPr>
-          <w:sz w:val="28"/>
-          <w:szCs w:val="28"/>
-        </w:rPr>
-        <w:t>Постусловие:</w:t>
-      </w:r>
-      <w:r>
-        <w:rPr>
-          <w:sz w:val="28"/>
-          <w:szCs w:val="28"/>
-        </w:rPr>
-        <w:t xml:space="preserve"> после успешной аренды </w:t>
-      </w:r>
-      <w:r>
-        <w:rPr>
-          <w:sz w:val="28"/>
-          <w:szCs w:val="28"/>
-          <w:lang w:val="en-US"/>
-        </w:rPr>
-        <w:t>VPS</w:t>
-      </w:r>
-      <w:r>
-        <w:rPr>
-          <w:sz w:val="28"/>
-          <w:szCs w:val="28"/>
-        </w:rPr>
-        <w:t xml:space="preserve"> </w:t>
-      </w:r>
-      <w:r>
-        <w:rPr>
-          <w:sz w:val="28"/>
-          <w:szCs w:val="28"/>
-        </w:rPr>
-        <w:t xml:space="preserve">все необходимые данные о использованных ресурсах, созданной виртуальной машине, оплате и </w:t>
-      </w:r>
-      <w:proofErr w:type="spellStart"/>
-      <w:r>
-        <w:rPr>
-          <w:sz w:val="28"/>
-          <w:szCs w:val="28"/>
-        </w:rPr>
-        <w:t>т.д</w:t>
-      </w:r>
-      <w:proofErr w:type="spellEnd"/>
-      <w:r>
-        <w:rPr>
-          <w:sz w:val="28"/>
-          <w:szCs w:val="28"/>
-        </w:rPr>
-        <w:t xml:space="preserve"> веб-сервер сохраняет в базе данных. Пользователь видит готовую для использования виртуальную машину в личном кабинете.</w:t>
-      </w:r>
-    </w:p>
-    <w:p>
-      <w:pPr>
-        <w:pStyle w:val="a6"/>
-        <w:numPr>
-          <w:ilvl w:val="0"/>
-          <w:numId w:val="2"/>
-        </w:numPr>
-        <w:spacing w:line="360" w:lineRule="auto"/>
-        <w:ind w:left="0" w:firstLine="709"/>
-        <w:jc w:val="both"/>
-        <w:rPr>
-          <w:sz w:val="28"/>
-          <w:szCs w:val="28"/>
-        </w:rPr>
-      </w:pPr>
-      <w:r>
-        <w:rPr>
-          <w:sz w:val="28"/>
-          <w:szCs w:val="28"/>
-        </w:rPr>
-        <w:t>Прецедент «Удалить подготовленную конфигурацию».</w:t>
-      </w:r>
-    </w:p>
-    <w:p>
-      <w:pPr>
-        <w:spacing w:line="360" w:lineRule="auto"/>
-        <w:ind w:firstLine="709"/>
-        <w:jc w:val="both"/>
-        <w:rPr>
-          <w:sz w:val="28"/>
-          <w:szCs w:val="28"/>
-        </w:rPr>
-      </w:pPr>
-      <w:r>
-        <w:rPr>
-          <w:sz w:val="28"/>
-          <w:szCs w:val="28"/>
-        </w:rPr>
-        <w:t>Название: «Удалить подготовленную конфигурацию» (</w:t>
-      </w:r>
-      <w:r>
-        <w:rPr>
-          <w:sz w:val="28"/>
-          <w:szCs w:val="28"/>
-          <w:lang w:val="en-US"/>
-        </w:rPr>
-        <w:t>Delete</w:t>
-      </w:r>
-      <w:r>
-        <w:rPr>
-          <w:sz w:val="28"/>
-          <w:szCs w:val="28"/>
-        </w:rPr>
-        <w:t xml:space="preserve"> </w:t>
-      </w:r>
-      <w:r>
-        <w:rPr>
-          <w:sz w:val="28"/>
-          <w:szCs w:val="28"/>
-          <w:lang w:val="en-US"/>
-        </w:rPr>
-        <w:t>prepared</w:t>
-      </w:r>
-      <w:r>
-        <w:rPr>
-          <w:sz w:val="28"/>
-          <w:szCs w:val="28"/>
-        </w:rPr>
-        <w:t xml:space="preserve"> </w:t>
-      </w:r>
-      <w:r>
-        <w:rPr>
-          <w:sz w:val="28"/>
-          <w:szCs w:val="28"/>
-          <w:lang w:val="en-US"/>
-        </w:rPr>
-        <w:t>config</w:t>
-      </w:r>
-      <w:r>
-        <w:rPr>
-          <w:sz w:val="28"/>
-          <w:szCs w:val="28"/>
-        </w:rPr>
-        <w:t>)</w:t>
-      </w:r>
-      <w:r>
-        <w:rPr>
-          <w:sz w:val="28"/>
-          <w:szCs w:val="28"/>
-        </w:rPr>
-        <w:t>.</w:t>
-      </w:r>
-    </w:p>
-    <w:p>
-      <w:pPr>
-        <w:spacing w:line="360" w:lineRule="auto"/>
-        <w:ind w:firstLine="709"/>
-        <w:jc w:val="both"/>
-        <w:rPr>
-          <w:sz w:val="28"/>
-          <w:szCs w:val="28"/>
-        </w:rPr>
-      </w:pPr>
-      <w:r>
-        <w:rPr>
-          <w:sz w:val="28"/>
-          <w:szCs w:val="28"/>
-        </w:rPr>
-        <w:t>Предусловие:</w:t>
-      </w:r>
-      <w:r>
-        <w:rPr>
-          <w:sz w:val="28"/>
-          <w:szCs w:val="28"/>
-        </w:rPr>
-        <w:t xml:space="preserve"> пользователь авторизован в системе под ролью «Администратор», в системе на момент удаления существует хотя бы одна подготовленная конфигурация.</w:t>
-      </w:r>
-    </w:p>
-    <w:p>
-      <w:pPr>
-        <w:spacing w:line="360" w:lineRule="auto"/>
-        <w:ind w:firstLine="709"/>
-        <w:jc w:val="both"/>
-        <w:rPr>
-          <w:sz w:val="28"/>
-          <w:szCs w:val="28"/>
-        </w:rPr>
-      </w:pPr>
-      <w:r>
-        <w:rPr>
-          <w:sz w:val="28"/>
-          <w:szCs w:val="28"/>
-        </w:rPr>
-        <w:t>Действующее лицо:</w:t>
-      </w:r>
-      <w:r>
-        <w:rPr>
-          <w:sz w:val="28"/>
-          <w:szCs w:val="28"/>
-        </w:rPr>
-        <w:t xml:space="preserve"> </w:t>
-      </w:r>
-      <w:r>
-        <w:rPr>
-          <w:sz w:val="28"/>
-          <w:szCs w:val="28"/>
-        </w:rPr>
-        <w:t xml:space="preserve">администратор веб-приложения. </w:t>
-      </w:r>
-    </w:p>
-    <w:p>
-      <w:pPr>
-        <w:spacing w:line="360" w:lineRule="auto"/>
-        <w:ind w:firstLine="709"/>
-        <w:jc w:val="both"/>
-        <w:rPr>
-          <w:sz w:val="28"/>
-          <w:szCs w:val="28"/>
-        </w:rPr>
-      </w:pPr>
-      <w:r>
-        <w:rPr>
-          <w:sz w:val="28"/>
-          <w:szCs w:val="28"/>
-        </w:rPr>
-        <w:t>Основной поток:</w:t>
-      </w:r>
-      <w:r>
-        <w:rPr>
-          <w:sz w:val="28"/>
-          <w:szCs w:val="28"/>
-        </w:rPr>
-        <w:t xml:space="preserve"> администратор заходит в панель управления веб-приложением, перейдя по специальному </w:t>
-      </w:r>
-      <w:r>
-        <w:rPr>
-          <w:sz w:val="28"/>
-          <w:szCs w:val="28"/>
-          <w:lang w:val="en-US"/>
-        </w:rPr>
-        <w:t>URL</w:t>
-      </w:r>
-      <w:r>
-        <w:rPr>
-          <w:sz w:val="28"/>
-          <w:szCs w:val="28"/>
-        </w:rPr>
-        <w:t xml:space="preserve"> </w:t>
-      </w:r>
-      <w:r>
-        <w:rPr>
-          <w:sz w:val="28"/>
-          <w:szCs w:val="28"/>
-        </w:rPr>
-        <w:t xml:space="preserve">адресу. </w:t>
-      </w:r>
-    </w:p>
-    <w:p>
-      <w:pPr>
-        <w:spacing w:line="360" w:lineRule="auto"/>
-        <w:ind w:firstLine="709"/>
-        <w:jc w:val="both"/>
-        <w:rPr>
-          <w:sz w:val="28"/>
-          <w:szCs w:val="28"/>
-        </w:rPr>
-      </w:pPr>
-      <w:r>
-        <w:rPr>
-          <w:sz w:val="28"/>
-          <w:szCs w:val="28"/>
-        </w:rPr>
-        <w:t xml:space="preserve">В боковом меню выбирает пункт «Управление конфигурациями», тем </w:t>
-      </w:r>
-      <w:r>
-        <w:rPr>
-          <w:sz w:val="28"/>
-          <w:szCs w:val="28"/>
-        </w:rPr>
-        <w:lastRenderedPageBreak/>
-        <w:t xml:space="preserve">самым попадая на страницу со списком всех готовых конфигураций и доступных действиях с ними. </w:t>
-      </w:r>
-      <w:r>
-        <w:rPr>
-          <w:sz w:val="28"/>
-          <w:szCs w:val="28"/>
-        </w:rPr>
-        <w:t>Администратор нажимает на кнопку «Удалить конфигурацию», после чего появляется окно с подтверждением операции. После подтверждения на кнопку «Да», подготовленная конфигурация удаляется.</w:t>
-      </w:r>
-    </w:p>
-    <w:p>
-      <w:pPr>
-        <w:spacing w:line="360" w:lineRule="auto"/>
-        <w:ind w:firstLine="709"/>
-        <w:jc w:val="both"/>
-        <w:rPr>
-          <w:sz w:val="28"/>
-          <w:szCs w:val="28"/>
-        </w:rPr>
-      </w:pPr>
-      <w:r>
-        <w:rPr>
-          <w:sz w:val="28"/>
-          <w:szCs w:val="28"/>
-        </w:rPr>
-        <w:t>Альтернативный поток:</w:t>
-      </w:r>
-      <w:r>
-        <w:rPr>
-          <w:sz w:val="28"/>
-          <w:szCs w:val="28"/>
-        </w:rPr>
-        <w:t xml:space="preserve"> в окне с подтверждением операции администратор нажимает кнопку «Нет», что возвращает его на страницу со списком всех готовых конфигураций.</w:t>
-      </w:r>
-    </w:p>
-    <w:p>
-      <w:pPr>
-        <w:spacing w:line="360" w:lineRule="auto"/>
-        <w:ind w:firstLine="709"/>
-        <w:jc w:val="both"/>
-        <w:rPr>
-          <w:sz w:val="28"/>
-          <w:szCs w:val="28"/>
-        </w:rPr>
-      </w:pPr>
-      <w:r>
-        <w:rPr>
-          <w:sz w:val="28"/>
-          <w:szCs w:val="28"/>
-        </w:rPr>
-        <w:t>Постусловие:</w:t>
-      </w:r>
-      <w:r>
-        <w:rPr>
-          <w:sz w:val="28"/>
-          <w:szCs w:val="28"/>
-        </w:rPr>
-        <w:t xml:space="preserve"> подготовленная конфигурация удаляется из базы данных и </w:t>
-      </w:r>
-      <w:r>
-        <w:rPr>
-          <w:sz w:val="28"/>
-          <w:szCs w:val="28"/>
-        </w:rPr>
-        <w:t>перестает</w:t>
-      </w:r>
-      <w:r>
-        <w:rPr>
-          <w:sz w:val="28"/>
-          <w:szCs w:val="28"/>
-        </w:rPr>
-        <w:t xml:space="preserve"> </w:t>
-      </w:r>
-      <w:r>
-        <w:rPr>
-          <w:sz w:val="28"/>
-          <w:szCs w:val="28"/>
-        </w:rPr>
-        <w:t>отображаться</w:t>
-      </w:r>
-      <w:r>
-        <w:rPr>
-          <w:sz w:val="28"/>
-          <w:szCs w:val="28"/>
-        </w:rPr>
-        <w:t xml:space="preserve"> в веб-приложении в блоке со всеми конфигурациями.</w:t>
-      </w:r>
-    </w:p>
-    <w:p>
-      <w:pPr>
-        <w:pStyle w:val="a6"/>
-        <w:numPr>
-          <w:ilvl w:val="0"/>
-          <w:numId w:val="2"/>
-        </w:numPr>
-        <w:spacing w:line="360" w:lineRule="auto"/>
-        <w:ind w:left="0" w:firstLine="709"/>
-        <w:jc w:val="both"/>
-        <w:rPr>
-          <w:sz w:val="28"/>
-          <w:szCs w:val="28"/>
-        </w:rPr>
-      </w:pPr>
-      <w:r>
-        <w:rPr>
-          <w:sz w:val="28"/>
-          <w:szCs w:val="28"/>
-        </w:rPr>
-        <w:t>Прецедент «</w:t>
-      </w:r>
-      <w:r>
-        <w:rPr>
-          <w:sz w:val="28"/>
-          <w:szCs w:val="28"/>
-        </w:rPr>
-        <w:t>Детально просмотреть конфигурацию арендованного</w:t>
-      </w:r>
-      <w:r>
-        <w:rPr>
-          <w:sz w:val="28"/>
-          <w:szCs w:val="28"/>
-        </w:rPr>
-        <w:t xml:space="preserve"> </w:t>
-      </w:r>
-      <w:r>
-        <w:rPr>
-          <w:sz w:val="28"/>
-          <w:szCs w:val="28"/>
-          <w:lang w:val="en-US"/>
-        </w:rPr>
-        <w:t>VPS</w:t>
-      </w:r>
-      <w:r>
-        <w:rPr>
-          <w:sz w:val="28"/>
-          <w:szCs w:val="28"/>
-        </w:rPr>
-        <w:t>».</w:t>
-      </w:r>
-    </w:p>
-    <w:p>
-      <w:pPr>
-        <w:spacing w:line="360" w:lineRule="auto"/>
-        <w:ind w:firstLine="709"/>
-        <w:jc w:val="both"/>
-        <w:rPr>
-          <w:sz w:val="28"/>
-          <w:szCs w:val="28"/>
-        </w:rPr>
-      </w:pPr>
-      <w:r>
-        <w:rPr>
-          <w:sz w:val="28"/>
-          <w:szCs w:val="28"/>
-        </w:rPr>
-        <w:t xml:space="preserve">Название: </w:t>
-      </w:r>
-      <w:r>
-        <w:rPr>
-          <w:sz w:val="28"/>
-          <w:szCs w:val="28"/>
-        </w:rPr>
-        <w:t xml:space="preserve">«Детально просмотреть конфигурацию арендованного </w:t>
-      </w:r>
-      <w:r>
-        <w:rPr>
-          <w:sz w:val="28"/>
-          <w:szCs w:val="28"/>
-          <w:lang w:val="en-US"/>
-        </w:rPr>
-        <w:t>VPS</w:t>
-      </w:r>
-      <w:r>
-        <w:rPr>
-          <w:sz w:val="28"/>
-          <w:szCs w:val="28"/>
-        </w:rPr>
-        <w:t>.</w:t>
-      </w:r>
-      <w:r>
-        <w:rPr>
-          <w:sz w:val="28"/>
-          <w:szCs w:val="28"/>
-        </w:rPr>
-        <w:t>» (</w:t>
-      </w:r>
-      <w:r>
-        <w:rPr>
-          <w:sz w:val="28"/>
-          <w:szCs w:val="28"/>
-          <w:lang w:val="en-US"/>
-        </w:rPr>
-        <w:t>View</w:t>
-      </w:r>
-      <w:r>
-        <w:rPr>
-          <w:sz w:val="28"/>
-          <w:szCs w:val="28"/>
-        </w:rPr>
-        <w:t xml:space="preserve"> </w:t>
-      </w:r>
-      <w:r>
-        <w:rPr>
-          <w:sz w:val="28"/>
-          <w:szCs w:val="28"/>
-          <w:lang w:val="en-US"/>
-        </w:rPr>
-        <w:t>VPS</w:t>
-      </w:r>
-      <w:r>
-        <w:rPr>
-          <w:sz w:val="28"/>
-          <w:szCs w:val="28"/>
-        </w:rPr>
-        <w:t xml:space="preserve"> </w:t>
-      </w:r>
-      <w:r>
-        <w:rPr>
-          <w:sz w:val="28"/>
-          <w:szCs w:val="28"/>
-          <w:lang w:val="en-US"/>
-        </w:rPr>
-        <w:t>details</w:t>
-      </w:r>
-      <w:r>
-        <w:rPr>
-          <w:sz w:val="28"/>
-          <w:szCs w:val="28"/>
-        </w:rPr>
-        <w:t>).</w:t>
-      </w:r>
-    </w:p>
-    <w:p>
-      <w:pPr>
-        <w:spacing w:line="360" w:lineRule="auto"/>
-        <w:ind w:firstLine="709"/>
-        <w:jc w:val="both"/>
-        <w:rPr>
-          <w:sz w:val="28"/>
-          <w:szCs w:val="28"/>
-        </w:rPr>
-      </w:pPr>
-      <w:r>
-        <w:rPr>
-          <w:sz w:val="28"/>
-          <w:szCs w:val="28"/>
-        </w:rPr>
-        <w:t>Предусловие:</w:t>
-      </w:r>
-      <w:r>
-        <w:rPr>
-          <w:sz w:val="28"/>
-          <w:szCs w:val="28"/>
-        </w:rPr>
-        <w:t xml:space="preserve"> пользователь, желающий </w:t>
-      </w:r>
-      <w:r>
-        <w:rPr>
-          <w:sz w:val="28"/>
-          <w:szCs w:val="28"/>
-        </w:rPr>
-        <w:t>просмотреть</w:t>
-      </w:r>
-      <w:r>
-        <w:rPr>
-          <w:sz w:val="28"/>
-          <w:szCs w:val="28"/>
-        </w:rPr>
-        <w:t xml:space="preserve"> конфигурацию арендованного </w:t>
-      </w:r>
-      <w:r>
-        <w:rPr>
-          <w:sz w:val="28"/>
-          <w:szCs w:val="28"/>
-          <w:lang w:val="en-US"/>
-        </w:rPr>
-        <w:t>VPS</w:t>
-      </w:r>
-      <w:r>
-        <w:rPr>
-          <w:sz w:val="28"/>
-          <w:szCs w:val="28"/>
-        </w:rPr>
-        <w:t xml:space="preserve">, </w:t>
-      </w:r>
-      <w:r>
-        <w:rPr>
-          <w:sz w:val="28"/>
-          <w:szCs w:val="28"/>
-        </w:rPr>
-        <w:t xml:space="preserve">зарегистрирован и авторизован в веб-приложении. Также этот пользователь имеет хотя бы один арендованный </w:t>
-      </w:r>
-      <w:r>
-        <w:rPr>
-          <w:sz w:val="28"/>
-          <w:szCs w:val="28"/>
-          <w:lang w:val="en-US"/>
-        </w:rPr>
-        <w:t>VPS</w:t>
-      </w:r>
-      <w:r>
-        <w:rPr>
-          <w:sz w:val="28"/>
-          <w:szCs w:val="28"/>
-        </w:rPr>
-        <w:t>.</w:t>
-      </w:r>
-    </w:p>
-    <w:p>
-      <w:pPr>
-        <w:spacing w:line="360" w:lineRule="auto"/>
-        <w:ind w:firstLine="709"/>
-        <w:jc w:val="both"/>
-        <w:rPr>
-          <w:sz w:val="28"/>
-          <w:szCs w:val="28"/>
-        </w:rPr>
-      </w:pPr>
-      <w:r>
-        <w:rPr>
-          <w:sz w:val="28"/>
-          <w:szCs w:val="28"/>
-        </w:rPr>
-        <w:t>Действующее лицо: клиент веб-приложения.</w:t>
-      </w:r>
-    </w:p>
-    <w:p>
-      <w:pPr>
-        <w:spacing w:line="360" w:lineRule="auto"/>
-        <w:ind w:firstLine="709"/>
-        <w:jc w:val="both"/>
-        <w:rPr>
-          <w:sz w:val="28"/>
-          <w:szCs w:val="28"/>
-        </w:rPr>
-      </w:pPr>
-      <w:r>
-        <w:rPr>
-          <w:sz w:val="28"/>
-          <w:szCs w:val="28"/>
-        </w:rPr>
-        <w:t>Основной поток:</w:t>
-      </w:r>
-      <w:r>
-        <w:rPr>
-          <w:sz w:val="28"/>
-          <w:szCs w:val="28"/>
-        </w:rPr>
-        <w:t xml:space="preserve"> пользователь заходит в личный кабинет, нажав на кнопку «Личный кабинет». Использовав кнопку «Арендованные </w:t>
-      </w:r>
-      <w:r>
-        <w:rPr>
-          <w:sz w:val="28"/>
-          <w:szCs w:val="28"/>
-          <w:lang w:val="en-US"/>
-        </w:rPr>
-        <w:t>VPS</w:t>
-      </w:r>
-      <w:r>
-        <w:rPr>
-          <w:sz w:val="28"/>
-          <w:szCs w:val="28"/>
-        </w:rPr>
-        <w:t xml:space="preserve">» в личном кабинете, пользователь переходит во вкладку, где отображаются все арендованные </w:t>
-      </w:r>
-      <w:r>
-        <w:rPr>
-          <w:sz w:val="28"/>
-          <w:szCs w:val="28"/>
-          <w:lang w:val="en-US"/>
-        </w:rPr>
-        <w:t>VPS</w:t>
-      </w:r>
-      <w:r>
-        <w:rPr>
-          <w:sz w:val="28"/>
-          <w:szCs w:val="28"/>
-        </w:rPr>
-        <w:t xml:space="preserve"> </w:t>
-      </w:r>
-      <w:r>
-        <w:rPr>
-          <w:sz w:val="28"/>
-          <w:szCs w:val="28"/>
-        </w:rPr>
-        <w:t xml:space="preserve">клиента. </w:t>
-      </w:r>
-    </w:p>
-    <w:p>
-      <w:pPr>
-        <w:spacing w:line="360" w:lineRule="auto"/>
-        <w:ind w:firstLine="709"/>
-        <w:jc w:val="both"/>
-        <w:rPr>
-          <w:sz w:val="28"/>
-          <w:szCs w:val="28"/>
-        </w:rPr>
-      </w:pPr>
-      <w:r>
-        <w:rPr>
-          <w:sz w:val="28"/>
-          <w:szCs w:val="28"/>
-        </w:rPr>
-        <w:t xml:space="preserve">Пользователь нажимает на кнопку «Детальный просмотр» и переходит на страницу, где отображается вся информация о конфигурации </w:t>
-      </w:r>
-      <w:r>
-        <w:rPr>
-          <w:sz w:val="28"/>
-          <w:szCs w:val="28"/>
-          <w:lang w:val="en-US"/>
-        </w:rPr>
-        <w:t>VPS</w:t>
-      </w:r>
-      <w:r>
-        <w:rPr>
-          <w:sz w:val="28"/>
-          <w:szCs w:val="28"/>
-        </w:rPr>
-        <w:t>,</w:t>
-      </w:r>
-      <w:r>
-        <w:rPr>
-          <w:sz w:val="28"/>
-          <w:szCs w:val="28"/>
-        </w:rPr>
-        <w:t xml:space="preserve"> ежемесячной оплате и т.д.</w:t>
-      </w:r>
-    </w:p>
-    <w:p>
-      <w:pPr>
-        <w:spacing w:line="360" w:lineRule="auto"/>
-        <w:ind w:firstLine="709"/>
-        <w:jc w:val="both"/>
-        <w:rPr>
-          <w:sz w:val="28"/>
-          <w:szCs w:val="28"/>
-        </w:rPr>
-      </w:pPr>
-      <w:r>
-        <w:rPr>
-          <w:sz w:val="28"/>
-          <w:szCs w:val="28"/>
-        </w:rPr>
-        <w:t>Постусловие:</w:t>
-      </w:r>
-      <w:r>
-        <w:rPr>
-          <w:sz w:val="28"/>
-          <w:szCs w:val="28"/>
-        </w:rPr>
-        <w:t xml:space="preserve"> пользователь, желающий посмотреть всю конфигурацию </w:t>
-      </w:r>
-      <w:r>
-        <w:rPr>
-          <w:sz w:val="28"/>
-          <w:szCs w:val="28"/>
-          <w:lang w:val="en-US"/>
-        </w:rPr>
-        <w:t>VPS</w:t>
-      </w:r>
-      <w:r>
-        <w:rPr>
-          <w:sz w:val="28"/>
-          <w:szCs w:val="28"/>
-        </w:rPr>
-        <w:t>, видит всю информацию на соответствующей странице.</w:t>
-      </w:r>
-    </w:p>
-    <w:p>
-      <w:pPr>
-        <w:spacing w:line="360" w:lineRule="auto"/>
-        <w:ind w:firstLine="709"/>
-        <w:jc w:val="both"/>
-        <w:rPr>
-          <w:sz w:val="28"/>
-          <w:szCs w:val="28"/>
-        </w:rPr>
-      </w:pPr>
-    </w:p>
-    <w:p>
-      <w:pPr>
-        <w:widowControl/>
-        <w:spacing w:line="360" w:lineRule="auto"/>
         <w:jc w:val="center"/>
-      </w:pPr>
-      <w:r>
+        <w:rPr>
+          <w:sz w:val="28"/>
+          <w:szCs w:val="28"/>
+        </w:rPr>
+      </w:pPr>
+      <w:r>
+        <w:rPr>
+          <w:sz w:val="28"/>
+          <w:szCs w:val="28"/>
+        </w:rPr>
         <w:lastRenderedPageBreak/>
         <w:drawing>
-          <wp:inline distT="0" distB="0" distL="0" distR="0" wp14:anchorId="37F0399C" wp14:editId="15E5FDA2">
-            <wp:extent cx="5585460" cy="3299460"/>
+          <wp:inline distT="0" distB="0" distL="0" distR="0" wp14:anchorId="46CC3101" wp14:editId="7B85B6C0">
+            <wp:extent cx="5940425" cy="2479040"/>
             <wp:effectExtent l="0" t="0" r="0" b="0"/>
-            <wp:docPr id="3" name="Рисунок 3"/>
+            <wp:docPr id="2" name="Рисунок 2"/>
             <wp:cNvGraphicFramePr>
               <a:graphicFrameLocks xmlns:a="http://schemas.openxmlformats.org/drawingml/2006/main" noChangeAspect="1"/>
             </wp:cNvGraphicFramePr>
@@ -2223,27 +1166,20 @@
                     <pic:cNvPr id="1" name=""/>
                     <pic:cNvPicPr/>
                   </pic:nvPicPr>
-                  <pic:blipFill rotWithShape="1">
+                  <pic:blipFill>
                     <a:blip r:embed="rId8"/>
-                    <a:srcRect l="1924" t="6570" r="4051" b="1660"/>
-                    <a:stretch/>
+                    <a:stretch>
+                      <a:fillRect/>
+                    </a:stretch>
                   </pic:blipFill>
-                  <pic:spPr bwMode="auto">
+                  <pic:spPr>
                     <a:xfrm>
                       <a:off x="0" y="0"/>
-                      <a:ext cx="5585460" cy="3299460"/>
+                      <a:ext cx="5940425" cy="2479040"/>
                     </a:xfrm>
                     <a:prstGeom prst="rect">
                       <a:avLst/>
                     </a:prstGeom>
-                    <a:ln>
-                      <a:noFill/>
-                    </a:ln>
-                    <a:extLst>
-                      <a:ext uri="{53640926-AAD7-44D8-BBD7-CCE9431645EC}">
-                        <a14:shadowObscured xmlns:a14="http://schemas.microsoft.com/office/drawing/2010/main"/>
-                      </a:ext>
-                    </a:extLst>
                   </pic:spPr>
                 </pic:pic>
               </a:graphicData>
@@ -2256,6 +1192,10 @@
       <w:pPr>
         <w:spacing w:line="360" w:lineRule="auto"/>
         <w:jc w:val="center"/>
+        <w:rPr>
+          <w:sz w:val="28"/>
+          <w:szCs w:val="28"/>
+        </w:rPr>
       </w:pPr>
       <w:r>
         <w:rPr>
@@ -2264,23 +1204,6 @@
         </w:rPr>
         <w:t xml:space="preserve">Рисунок 2. </w:t>
       </w:r>
-      <w:r>
-        <w:rPr>
-          <w:sz w:val="28"/>
-          <w:szCs w:val="28"/>
-        </w:rPr>
-        <w:t>Диаграмма классов.</w:t>
-      </w:r>
-    </w:p>
-    <w:p>
-      <w:pPr>
-        <w:spacing w:line="360" w:lineRule="auto"/>
-        <w:jc w:val="center"/>
-        <w:rPr>
-          <w:sz w:val="28"/>
-          <w:szCs w:val="28"/>
-        </w:rPr>
-      </w:pPr>
     </w:p>
     <w:p>
       <w:pPr>
@@ -2312,61 +1235,22 @@
         <w:rPr>
           <w:sz w:val="28"/>
         </w:rPr>
-        <w:t xml:space="preserve">Я научился моделировать взаимоотношения элементов внешней среды с элементами </w:t>
-      </w:r>
-      <w:r>
-        <w:rPr>
-          <w:sz w:val="28"/>
-        </w:rPr>
-        <w:t>проектируемой</w:t>
-      </w:r>
-      <w:r>
-        <w:rPr>
-          <w:sz w:val="28"/>
-        </w:rPr>
-        <w:t xml:space="preserve"> программной </w:t>
-      </w:r>
-      <w:r>
-        <w:rPr>
-          <w:sz w:val="28"/>
-        </w:rPr>
-        <w:t>системы</w:t>
-      </w:r>
-      <w:r>
-        <w:rPr>
-          <w:sz w:val="28"/>
-        </w:rPr>
-        <w:t xml:space="preserve"> через синтез прецедентов, их расширенное описание и включение диаграмму </w:t>
+        <w:t xml:space="preserve">Я изучил методы анализа поведения компонентов программной системы путем синтеза диаграмм, описывающих поведение моделируемой ИС с использованием нотации </w:t>
       </w:r>
       <w:proofErr w:type="spellStart"/>
       <w:r>
         <w:rPr>
           <w:sz w:val="28"/>
-        </w:rPr>
-        <w:t>UseCase</w:t>
+          <w:lang w:val="en-US"/>
+        </w:rPr>
+        <w:t>Uml</w:t>
       </w:r>
       <w:proofErr w:type="spellEnd"/>
       <w:r>
         <w:rPr>
           <w:sz w:val="28"/>
         </w:rPr>
-        <w:t xml:space="preserve">. </w:t>
-      </w:r>
-    </w:p>
-    <w:p>
-      <w:pPr>
-        <w:spacing w:line="360" w:lineRule="auto"/>
-        <w:ind w:firstLine="708"/>
-        <w:jc w:val="both"/>
-        <w:rPr>
-          <w:sz w:val="28"/>
-        </w:rPr>
-      </w:pPr>
-      <w:r>
-        <w:rPr>
-          <w:sz w:val="28"/>
-        </w:rPr>
-        <w:t>Выполнил анализ объекта информатиза0ции и смоделировал структуры будущей программной системы на верхнем уровне в виде конечных диаграмм классов.</w:t>
+        <w:t>.</w:t>
       </w:r>
     </w:p>
     <w:sectPr>
@@ -3071,7 +1955,7 @@
   <w:style w:type="paragraph" w:default="1" w:styleId="a">
     <w:name w:val="Normal"/>
     <w:qFormat/>
-    <w:rsid w:val="00556DFC"/>
+    <w:rsid w:val="008860E7"/>
     <w:pPr>
       <w:widowControl w:val="0"/>
     </w:pPr>

</xml_diff>